<commit_message>
v2.6.0: DOCX style architecture overhaul — styles-first approach
Fixes:
- Remove duplicate Heading1-4 styleIds (caused navigation pane failure)
- Remove w:dirty=true from TOC field (caused security warning on open)
- Confirm updateFields absent from settings.xml

New styles in fix_generated_docx:
- Caption: 10pt bold centered for figure/table captions
- TOC1/TOC2/TOC3: Word TOC entry styles with tab stops + dot leaders
- Heading5-9: outlineLvl, qFormat, font/color fixed
- keepNext + keepLines on Heading1-4

TOC: cached entries use TOC1-3 styles, no w:dirty, no security warning
Caption: \imagecap now visible in DOCX with Caption style
Architecture: fix_generated_docx is single point of control for styles

45/45 DOCX checks pass, 33/33 tests pass.
</commit_message>
<xml_diff>
--- a/templates/guide/guide-reference.docx
+++ b/templates/guide/guide-reference.docx
@@ -1117,31 +1117,31 @@
   <w:style w:type="paragraph" w:customStyle="1" w:styleId="warning">
     <w:name w:val="warning"/>
     <w:pPr>
-      <w:ind w:left="283"/>
       <w:pBdr>
         <w:left w:val="single" w:sz="24" w:space="4" w:color="F57C00"/>
       </w:pBdr>
       <w:shd w:fill="FFF8E1" w:val="clear"/>
+      <w:ind w:left="283"/>
     </w:pPr>
   </w:style>
   <w:style w:type="paragraph" w:customStyle="1" w:styleId="tip">
     <w:name w:val="tip"/>
     <w:pPr>
-      <w:ind w:left="283"/>
       <w:pBdr>
         <w:left w:val="single" w:sz="24" w:space="4" w:color="2E7D32"/>
       </w:pBdr>
       <w:shd w:fill="E8F5E9" w:val="clear"/>
+      <w:ind w:left="283"/>
     </w:pPr>
   </w:style>
   <w:style w:type="paragraph" w:customStyle="1" w:styleId="infobox">
     <w:name w:val="infobox"/>
     <w:pPr>
-      <w:ind w:left="283"/>
       <w:pBdr>
         <w:left w:val="single" w:sz="24" w:space="4" w:color="1565C0"/>
       </w:pBdr>
       <w:shd w:fill="E3F2FD" w:val="clear"/>
+      <w:ind w:left="283"/>
     </w:pPr>
   </w:style>
   <w:style w:type="paragraph" w:customStyle="1" w:styleId="objectives">
@@ -1172,47 +1172,6 @@
       <w:color w:val="FFFFFF"/>
       <w:sz w:val="18"/>
       <w:shd w:fill="C7000B" w:val="clear"/>
-    </w:rPr>
-  </w:style>
-  <w:style w:type="paragraph" w:customStyle="1" w:styleId="Heading1">
-    <w:name w:val="heading 1"/>
-    <w:pPr>
-      <w:pBdr>
-        <w:bottom w:val="single" w:sz="12" w:space="1" w:color="C7000B"/>
-      </w:pBdr>
-    </w:pPr>
-    <w:rPr>
-      <w:rFonts w:ascii="HarmonyOS Sans" w:hAnsi="HarmonyOS Sans"/>
-      <w:b/>
-      <w:color w:val="1F2328"/>
-      <w:sz w:val="40"/>
-    </w:rPr>
-  </w:style>
-  <w:style w:type="paragraph" w:customStyle="1" w:styleId="Heading2">
-    <w:name w:val="heading 2"/>
-    <w:rPr>
-      <w:rFonts w:ascii="HarmonyOS Sans" w:hAnsi="HarmonyOS Sans"/>
-      <w:b/>
-      <w:color w:val="1F2328"/>
-      <w:sz w:val="36"/>
-    </w:rPr>
-  </w:style>
-  <w:style w:type="paragraph" w:customStyle="1" w:styleId="Heading3">
-    <w:name w:val="heading 3"/>
-    <w:rPr>
-      <w:rFonts w:ascii="HarmonyOS Sans" w:hAnsi="HarmonyOS Sans"/>
-      <w:b/>
-      <w:color w:val="1F2328"/>
-      <w:sz w:val="32"/>
-    </w:rPr>
-  </w:style>
-  <w:style w:type="paragraph" w:customStyle="1" w:styleId="Heading4">
-    <w:name w:val="heading 4"/>
-    <w:rPr>
-      <w:rFonts w:ascii="HarmonyOS Sans" w:hAnsi="HarmonyOS Sans"/>
-      <w:b/>
-      <w:color w:val="1F2328"/>
-      <w:sz w:val="28"/>
     </w:rPr>
   </w:style>
   <w:style w:type="paragraph" w:customStyle="1" w:styleId="CoverLogo">

</xml_diff>